<commit_message>
Disclose prior exploratory analysis: H1 is a pre-specified re-test; cite earlier repository
</commit_message>
<xml_diff>
--- a/manuscript/drafts/cover_letter_NoA.docx
+++ b/manuscript/drafts/cover_letter_NoA.docx
@@ -200,17 +200,7 @@
         <w:pStyle w:val="BodyText"/>
       </w:pPr>
       <w:r>
-        <w:t xml:space="preserve">The manuscript reports corrections that arose during the work, including an error in my own first interpretation that an external review helped me find; I have described these openly because I think they are part of the result. All datasets are public, and the analysis plan, code, deviation register and a script that regenerates every number in the paper will be available at </w:t>
-      </w:r>
-      <w:r>
-        <w:rPr>
-          <w:highlight w:val="yellow"/>
-        </w:rPr>
-        <w:t>[CHECK: repository URL and Zenodo DOI]</w:t>
-      </w:r>
-      <w:r>
-        <w:rPr/>
-        <w:t>.</w:t>
+        <w:t xml:space="preserve">The manuscript reports corrections that arose during the work, including an error in my own first interpretation that an external review helped me find; I have described these openly because I think they are part of the result. An earlier exploratory analysis of overlapping bulk data, which was not published, is publicly available and is cited in the manuscript. The present study re-tests its main result under a pre-specified plan and adds what that analysis lacked: a cell-type-level test, the donor and age analyses and an independent replication cohort. All datasets are public, and the analysis plan, code, deviation register and a script that regenerates every number in the paper are available at https://github.com/akarakus-bartin/ad-gbm-composition and archived on Zenodo (https://doi.org/10.5281/zenodo.23020912).</w:t>
       </w:r>
     </w:p>
     <w:p>

</xml_diff>

<commit_message>
Manuscript in passive voice; affiliation (Biotechnology, Faculty of Science); no competing interests; no funding
</commit_message>
<xml_diff>
--- a/manuscript/drafts/cover_letter_NoA.docx
+++ b/manuscript/drafts/cover_letter_NoA.docx
@@ -13,23 +13,13 @@
         <w:br/>
       </w:r>
       <w:r>
-        <w:t xml:space="preserve">Bartın University, </w:t>
+        <w:t xml:space="preserve">Department of Biotechnology, Faculty of Science, Bartın University, </w:t>
       </w:r>
       <w:r>
         <w:rPr>
           <w:highlight w:val="yellow"/>
         </w:rPr>
-        <w:t>[CHECK: department]</w:t>
-      </w:r>
-      <w:r>
-        <w:rPr/>
-        <w:t xml:space="preserve">, </w:t>
-      </w:r>
-      <w:r>
-        <w:rPr>
-          <w:highlight w:val="yellow"/>
-        </w:rPr>
-        <w:t>[CHECK: postal address]</w:t>
+        <w:t>[CHECK: postal code]</w:t>
       </w:r>
       <w:r>
         <w:rPr/>
@@ -208,17 +198,7 @@
         <w:pStyle w:val="BodyText"/>
       </w:pPr>
       <w:r>
-        <w:t xml:space="preserve">This work has not been published previously, is not under consideration elsewhere, and, if accepted, will not be published elsewhere in the same form. I declare </w:t>
-      </w:r>
-      <w:r>
-        <w:rPr>
-          <w:highlight w:val="yellow"/>
-        </w:rPr>
-        <w:t>[CHECK: no competing interests]</w:t>
-      </w:r>
-      <w:r>
-        <w:rPr/>
-        <w:t>. The use of generative AI tools during manuscript preparation is declared in the manuscript, as required by the journal’s policy.</w:t>
+        <w:t xml:space="preserve">This work has not been published previously, is not under consideration elsewhere, and, if accepted, will not be published elsewhere in the same form. I declare no competing interests, and the work received no specific funding. The use of generative AI tools during manuscript preparation is declared in the manuscript, as required by the journal’s policy.</w:t>
       </w:r>
     </w:p>
     <w:p>

</xml_diff>